<commit_message>
docs: bo icon khoi du an
</commit_message>
<xml_diff>
--- a/docs/Hướng dẫn viết tài liệu dự án.docx
+++ b/docs/Hướng dẫn viết tài liệu dự án.docx
@@ -5546,7 +5546,7 @@
           <w:bCs/>
           <w:szCs w:val="26"/>
         </w:rPr>
-        <w:t>✓</w:t>
+        <w:t/>
       </w:r>
       <w:r>
         <w:rPr>
@@ -5588,7 +5588,7 @@
           <w:bCs/>
           <w:szCs w:val="26"/>
         </w:rPr>
-        <w:t>✓</w:t>
+        <w:t/>
       </w:r>
       <w:r>
         <w:rPr>
@@ -5631,7 +5631,7 @@
           <w:bCs/>
           <w:szCs w:val="26"/>
         </w:rPr>
-        <w:t>✓</w:t>
+        <w:t/>
       </w:r>
       <w:r>
         <w:rPr>
@@ -5673,7 +5673,7 @@
           <w:bCs/>
           <w:szCs w:val="26"/>
         </w:rPr>
-        <w:t>✓</w:t>
+        <w:t/>
       </w:r>
       <w:r>
         <w:rPr>
@@ -5715,7 +5715,7 @@
           <w:bCs/>
           <w:szCs w:val="26"/>
         </w:rPr>
-        <w:t>✓</w:t>
+        <w:t/>
       </w:r>
       <w:r>
         <w:rPr>
@@ -5757,7 +5757,7 @@
           <w:bCs/>
           <w:szCs w:val="26"/>
         </w:rPr>
-        <w:t>✓</w:t>
+        <w:t/>
       </w:r>
       <w:r>
         <w:rPr>
@@ -5904,7 +5904,7 @@
           <w:bCs/>
           <w:szCs w:val="26"/>
         </w:rPr>
-        <w:t>✓</w:t>
+        <w:t/>
       </w:r>
       <w:r>
         <w:rPr>
@@ -5929,7 +5929,7 @@
           <w:bCs/>
           <w:szCs w:val="26"/>
         </w:rPr>
-        <w:t>✓</w:t>
+        <w:t/>
       </w:r>
       <w:r>
         <w:rPr>
@@ -5954,7 +5954,7 @@
           <w:bCs/>
           <w:szCs w:val="26"/>
         </w:rPr>
-        <w:t>✓</w:t>
+        <w:t/>
       </w:r>
       <w:r>
         <w:rPr>
@@ -5979,7 +5979,7 @@
           <w:bCs/>
           <w:szCs w:val="26"/>
         </w:rPr>
-        <w:t>✓</w:t>
+        <w:t/>
       </w:r>
       <w:r>
         <w:rPr>
@@ -6004,7 +6004,7 @@
           <w:bCs/>
           <w:szCs w:val="26"/>
         </w:rPr>
-        <w:t>✓</w:t>
+        <w:t/>
       </w:r>
       <w:r>
         <w:rPr>
@@ -6029,7 +6029,7 @@
           <w:bCs/>
           <w:szCs w:val="26"/>
         </w:rPr>
-        <w:t>✓</w:t>
+        <w:t/>
       </w:r>
       <w:r>
         <w:rPr>
@@ -10546,7 +10546,7 @@
             <w16se:symEx w16se:font="Segoe UI Emoji" w16se:char="1F60A"/>
           </mc:Choice>
           <mc:Fallback>
-            <w:t>😊</w:t>
+            <w:t/>
           </mc:Fallback>
         </mc:AlternateContent>
       </w:r>

</xml_diff>